<commit_message>
Aggiorna file docx e correzioni minori ai capitoli 03 e 06
</commit_message>
<xml_diff>
--- a/Industrial_Test_Bench-Caso_di_Studio.docx
+++ b/Industrial_Test_Bench-Caso_di_Studio.docx
@@ -3207,7 +3207,7 @@
     </w:p>
     <w:bookmarkEnd w:id="59"/>
     <w:bookmarkEnd w:id="60"/>
-    <w:bookmarkStart w:id="62" w:name="Xd66830c9f25a6bf4a05a41a0fa29b410c6ae85f"/>
+    <w:bookmarkStart w:id="77" w:name="Xd66830c9f25a6bf4a05a41a0fa29b410c6ae85f"/>
     <w:p>
       <w:pPr>
         <w:pStyle w:val="4"/>
@@ -3322,178 +3322,177 @@
       </w:r>
     </w:p>
     <w:bookmarkEnd w:id="61"/>
+    <w:bookmarkStart w:id="62" w:name="confini-del-sistema-as-is"/>
+    <w:p>
+      <w:pPr>
+        <w:pStyle w:val="6"/>
+      </w:pPr>
+      <w:r>
+        <w:t xml:space="preserve">2. Confini del Sistema (AS-IS)</w:t>
+      </w:r>
+    </w:p>
+    <w:p>
+      <w:pPr>
+        <w:pStyle w:val="FirstParagraph"/>
+      </w:pPr>
+      <w:r>
+        <w:t xml:space="preserve">Asset inclusi:</w:t>
+      </w:r>
+    </w:p>
+    <w:p>
+      <w:pPr>
+        <w:pStyle w:val="Compact"/>
+        <w:numPr>
+          <w:ilvl w:val="0"/>
+          <w:numId w:val="1050"/>
+        </w:numPr>
+      </w:pPr>
+      <w:r>
+        <w:t xml:space="preserve">PLC (controllo locale)</w:t>
+      </w:r>
+    </w:p>
+    <w:p>
+      <w:pPr>
+        <w:pStyle w:val="Compact"/>
+        <w:numPr>
+          <w:ilvl w:val="0"/>
+          <w:numId w:val="1050"/>
+        </w:numPr>
+      </w:pPr>
+      <w:r>
+        <w:t xml:space="preserve">HMI locale</w:t>
+      </w:r>
+    </w:p>
+    <w:p>
+      <w:pPr>
+        <w:pStyle w:val="Compact"/>
+        <w:numPr>
+          <w:ilvl w:val="0"/>
+          <w:numId w:val="1050"/>
+        </w:numPr>
+      </w:pPr>
+      <w:r>
+        <w:t xml:space="preserve">Sottosistema pressione (pompa, valvole, trasduttore di pressione, pressostato meccanico)</w:t>
+      </w:r>
+    </w:p>
+    <w:p>
+      <w:pPr>
+        <w:pStyle w:val="Compact"/>
+        <w:numPr>
+          <w:ilvl w:val="0"/>
+          <w:numId w:val="1050"/>
+        </w:numPr>
+      </w:pPr>
+      <w:r>
+        <w:t xml:space="preserve">Sottosistema temperatura (controllore stand-alone + camera/riscaldatore)</w:t>
+      </w:r>
+    </w:p>
+    <w:p>
+      <w:pPr>
+        <w:pStyle w:val="Compact"/>
+        <w:numPr>
+          <w:ilvl w:val="0"/>
+          <w:numId w:val="1050"/>
+        </w:numPr>
+      </w:pPr>
+      <w:r>
+        <w:t xml:space="preserve">Datalogger stand-alone</w:t>
+      </w:r>
+    </w:p>
+    <w:p>
+      <w:pPr>
+        <w:pStyle w:val="Compact"/>
+        <w:numPr>
+          <w:ilvl w:val="0"/>
+          <w:numId w:val="1050"/>
+        </w:numPr>
+      </w:pPr>
+      <w:r>
+        <w:t xml:space="preserve">DUT con intelligenza onboard e logging</w:t>
+      </w:r>
+    </w:p>
+    <w:p>
+      <w:pPr>
+        <w:pStyle w:val="Compact"/>
+        <w:numPr>
+          <w:ilvl w:val="0"/>
+          <w:numId w:val="1050"/>
+        </w:numPr>
+      </w:pPr>
+      <w:r>
+        <w:t xml:space="preserve">Azioni dell’operatore (coordinamento manuale ed estrazione dati)</w:t>
+      </w:r>
+    </w:p>
+    <w:p>
+      <w:pPr>
+        <w:pStyle w:val="FirstParagraph"/>
+      </w:pPr>
+      <w:r>
+        <w:t xml:space="preserve">Escluso (AS-IS):</w:t>
+      </w:r>
+    </w:p>
+    <w:p>
+      <w:pPr>
+        <w:pStyle w:val="Compact"/>
+        <w:numPr>
+          <w:ilvl w:val="0"/>
+          <w:numId w:val="1051"/>
+        </w:numPr>
+      </w:pPr>
+      <w:r>
+        <w:t xml:space="preserve">Accesso remoto (supervisione PC/tablet)</w:t>
+      </w:r>
+    </w:p>
+    <w:p>
+      <w:pPr>
+        <w:pStyle w:val="Compact"/>
+        <w:numPr>
+          <w:ilvl w:val="0"/>
+          <w:numId w:val="1051"/>
+        </w:numPr>
+      </w:pPr>
+      <w:r>
+        <w:t xml:space="preserve">Server centrale / historian / database</w:t>
+      </w:r>
+    </w:p>
+    <w:p>
+      <w:pPr>
+        <w:pStyle w:val="Compact"/>
+        <w:numPr>
+          <w:ilvl w:val="0"/>
+          <w:numId w:val="1051"/>
+        </w:numPr>
+      </w:pPr>
+      <w:r>
+        <w:t xml:space="preserve">Pipeline di generazione report automatizzata</w:t>
+      </w:r>
+    </w:p>
+    <w:p>
+      <w:pPr>
+        <w:pStyle w:val="Compact"/>
+        <w:numPr>
+          <w:ilvl w:val="0"/>
+          <w:numId w:val="1051"/>
+        </w:numPr>
+      </w:pPr>
+      <w:r>
+        <w:t xml:space="preserve">Segmentazione rete OT (nessuna rete OT in pratica)</w:t>
+      </w:r>
+    </w:p>
     <w:bookmarkEnd w:id="62"/>
-    <w:bookmarkStart w:id="63" w:name="confini-del-sistema-as-is"/>
-    <w:p>
-      <w:pPr>
-        <w:pStyle w:val="4"/>
-      </w:pPr>
-      <w:r>
-        <w:t xml:space="preserve">2. Confini del Sistema (AS-IS)</w:t>
-      </w:r>
-    </w:p>
-    <w:p>
-      <w:pPr>
-        <w:pStyle w:val="FirstParagraph"/>
-      </w:pPr>
-      <w:r>
-        <w:t xml:space="preserve">Asset inclusi:</w:t>
-      </w:r>
-    </w:p>
-    <w:p>
-      <w:pPr>
-        <w:pStyle w:val="Compact"/>
-        <w:numPr>
-          <w:ilvl w:val="0"/>
-          <w:numId w:val="1050"/>
-        </w:numPr>
-      </w:pPr>
-      <w:r>
-        <w:t xml:space="preserve">PLC (controllo locale)</w:t>
-      </w:r>
-    </w:p>
-    <w:p>
-      <w:pPr>
-        <w:pStyle w:val="Compact"/>
-        <w:numPr>
-          <w:ilvl w:val="0"/>
-          <w:numId w:val="1050"/>
-        </w:numPr>
-      </w:pPr>
-      <w:r>
-        <w:t xml:space="preserve">HMI locale</w:t>
-      </w:r>
-    </w:p>
-    <w:p>
-      <w:pPr>
-        <w:pStyle w:val="Compact"/>
-        <w:numPr>
-          <w:ilvl w:val="0"/>
-          <w:numId w:val="1050"/>
-        </w:numPr>
-      </w:pPr>
-      <w:r>
-        <w:t xml:space="preserve">Sottosistema pressione (pompa, valvole, trasduttore di pressione, pressostato meccanico)</w:t>
-      </w:r>
-    </w:p>
-    <w:p>
-      <w:pPr>
-        <w:pStyle w:val="Compact"/>
-        <w:numPr>
-          <w:ilvl w:val="0"/>
-          <w:numId w:val="1050"/>
-        </w:numPr>
-      </w:pPr>
-      <w:r>
-        <w:t xml:space="preserve">Sottosistema temperatura (controllore stand-alone + camera/riscaldatore)</w:t>
-      </w:r>
-    </w:p>
-    <w:p>
-      <w:pPr>
-        <w:pStyle w:val="Compact"/>
-        <w:numPr>
-          <w:ilvl w:val="0"/>
-          <w:numId w:val="1050"/>
-        </w:numPr>
-      </w:pPr>
-      <w:r>
-        <w:t xml:space="preserve">Datalogger stand-alone</w:t>
-      </w:r>
-    </w:p>
-    <w:p>
-      <w:pPr>
-        <w:pStyle w:val="Compact"/>
-        <w:numPr>
-          <w:ilvl w:val="0"/>
-          <w:numId w:val="1050"/>
-        </w:numPr>
-      </w:pPr>
-      <w:r>
-        <w:t xml:space="preserve">DUT con intelligenza onboard e logging</w:t>
-      </w:r>
-    </w:p>
-    <w:p>
-      <w:pPr>
-        <w:pStyle w:val="Compact"/>
-        <w:numPr>
-          <w:ilvl w:val="0"/>
-          <w:numId w:val="1050"/>
-        </w:numPr>
-      </w:pPr>
-      <w:r>
-        <w:t xml:space="preserve">Azioni dell’operatore (coordinamento manuale ed estrazione dati)</w:t>
-      </w:r>
-    </w:p>
-    <w:p>
-      <w:pPr>
-        <w:pStyle w:val="FirstParagraph"/>
-      </w:pPr>
-      <w:r>
-        <w:t xml:space="preserve">Escluso (AS-IS):</w:t>
-      </w:r>
-    </w:p>
-    <w:p>
-      <w:pPr>
-        <w:pStyle w:val="Compact"/>
-        <w:numPr>
-          <w:ilvl w:val="0"/>
-          <w:numId w:val="1051"/>
-        </w:numPr>
-      </w:pPr>
-      <w:r>
-        <w:t xml:space="preserve">Accesso remoto (supervisione PC/tablet)</w:t>
-      </w:r>
-    </w:p>
-    <w:p>
-      <w:pPr>
-        <w:pStyle w:val="Compact"/>
-        <w:numPr>
-          <w:ilvl w:val="0"/>
-          <w:numId w:val="1051"/>
-        </w:numPr>
-      </w:pPr>
-      <w:r>
-        <w:t xml:space="preserve">Server centrale / historian / database</w:t>
-      </w:r>
-    </w:p>
-    <w:p>
-      <w:pPr>
-        <w:pStyle w:val="Compact"/>
-        <w:numPr>
-          <w:ilvl w:val="0"/>
-          <w:numId w:val="1051"/>
-        </w:numPr>
-      </w:pPr>
-      <w:r>
-        <w:t xml:space="preserve">Pipeline di generazione report automatizzata</w:t>
-      </w:r>
-    </w:p>
-    <w:p>
-      <w:pPr>
-        <w:pStyle w:val="Compact"/>
-        <w:numPr>
-          <w:ilvl w:val="0"/>
-          <w:numId w:val="1051"/>
-        </w:numPr>
-      </w:pPr>
-      <w:r>
-        <w:t xml:space="preserve">Segmentazione rete OT (nessuna rete OT in pratica)</w:t>
-      </w:r>
-    </w:p>
-    <w:bookmarkEnd w:id="63"/>
-    <w:bookmarkStart w:id="68" w:name="mappa-delle-interfacce-fisiche-logiche"/>
-    <w:p>
-      <w:pPr>
-        <w:pStyle w:val="4"/>
+    <w:bookmarkStart w:id="67" w:name="mappa-delle-interfacce-fisiche-logiche"/>
+    <w:p>
+      <w:pPr>
+        <w:pStyle w:val="6"/>
       </w:pPr>
       <w:r>
         <w:t xml:space="preserve">3. Mappa delle Interfacce (Fisiche / Logiche)</w:t>
       </w:r>
     </w:p>
-    <w:bookmarkStart w:id="64" w:name="X8540f7c13a05e0d9be406b114fed819856ca7e0"/>
-    <w:p>
-      <w:pPr>
-        <w:pStyle w:val="6"/>
+    <w:bookmarkStart w:id="63" w:name="X8540f7c13a05e0d9be406b114fed819856ca7e0"/>
+    <w:p>
+      <w:pPr>
+        <w:pStyle w:val="7"/>
       </w:pPr>
       <w:r>
         <w:t xml:space="preserve">3.1 Interfacce di Controllo e Sicurezza (Segnali)</w:t>
@@ -4546,11 +4545,11 @@
         </w:tc>
       </w:tr>
     </w:tbl>
-    <w:bookmarkEnd w:id="64"/>
-    <w:bookmarkStart w:id="65" w:name="X2c67c1f6852efe50b1a01a864e501599f1fd5aa"/>
-    <w:p>
-      <w:pPr>
-        <w:pStyle w:val="6"/>
+    <w:bookmarkEnd w:id="63"/>
+    <w:bookmarkStart w:id="64" w:name="X2c67c1f6852efe50b1a01a864e501599f1fd5aa"/>
+    <w:p>
+      <w:pPr>
+        <w:pStyle w:val="7"/>
       </w:pPr>
       <w:r>
         <w:t xml:space="preserve">3.2 Interfacce di Acquisizione Dati (Da Misura a Logger)</w:t>
@@ -4892,11 +4891,11 @@
         </w:tc>
       </w:tr>
     </w:tbl>
-    <w:bookmarkEnd w:id="65"/>
-    <w:bookmarkStart w:id="66" w:name="interfacce-di-esportazione-dati-file"/>
-    <w:p>
-      <w:pPr>
-        <w:pStyle w:val="6"/>
+    <w:bookmarkEnd w:id="64"/>
+    <w:bookmarkStart w:id="65" w:name="interfacce-di-esportazione-dati-file"/>
+    <w:p>
+      <w:pPr>
+        <w:pStyle w:val="7"/>
       </w:pPr>
       <w:r>
         <w:t xml:space="preserve">3.3 Interfacce di Esportazione Dati (File)</w:t>
@@ -5475,11 +5474,11 @@
         </w:tc>
       </w:tr>
     </w:tbl>
-    <w:bookmarkEnd w:id="66"/>
-    <w:bookmarkStart w:id="67" w:name="Xdd23b2a03ff3fea91893b795ee0e5f98cf8ae4e"/>
-    <w:p>
-      <w:pPr>
-        <w:pStyle w:val="6"/>
+    <w:bookmarkEnd w:id="65"/>
+    <w:bookmarkStart w:id="66" w:name="Xdd23b2a03ff3fea91893b795ee0e5f98cf8ae4e"/>
+    <w:p>
+      <w:pPr>
+        <w:pStyle w:val="7"/>
       </w:pPr>
       <w:r>
         <w:t xml:space="preserve">3.4 Interfaccia Dati Real-Time del DUT (Presente ma NON utilizzata)</w:t>
@@ -5742,21 +5741,21 @@
         </w:tc>
       </w:tr>
     </w:tbl>
+    <w:bookmarkEnd w:id="66"/>
     <w:bookmarkEnd w:id="67"/>
-    <w:bookmarkEnd w:id="68"/>
-    <w:bookmarkStart w:id="71" w:name="mappa-dei-flussi-di-dati-end-to-end"/>
-    <w:p>
-      <w:pPr>
-        <w:pStyle w:val="4"/>
+    <w:bookmarkStart w:id="70" w:name="mappa-dei-flussi-di-dati-end-to-end"/>
+    <w:p>
+      <w:pPr>
+        <w:pStyle w:val="6"/>
       </w:pPr>
       <w:r>
         <w:t xml:space="preserve">4. Mappa dei Flussi di Dati (End-to-End)</w:t>
       </w:r>
     </w:p>
-    <w:bookmarkStart w:id="69" w:name="flussi-di-dati-durante-il-test"/>
-    <w:p>
-      <w:pPr>
-        <w:pStyle w:val="6"/>
+    <w:bookmarkStart w:id="68" w:name="flussi-di-dati-durante-il-test"/>
+    <w:p>
+      <w:pPr>
+        <w:pStyle w:val="7"/>
       </w:pPr>
       <w:r>
         <w:t xml:space="preserve">4.1 Flussi di Dati Durante il Test</w:t>
@@ -5906,11 +5905,11 @@
         <w:t xml:space="preserve">Non esiste un identificatore di test condiviso tra le sorgenti</w:t>
       </w:r>
     </w:p>
-    <w:bookmarkEnd w:id="69"/>
-    <w:bookmarkStart w:id="70" w:name="flussi-di-dati-a-fine-test"/>
-    <w:p>
-      <w:pPr>
-        <w:pStyle w:val="6"/>
+    <w:bookmarkEnd w:id="68"/>
+    <w:bookmarkStart w:id="69" w:name="flussi-di-dati-a-fine-test"/>
+    <w:p>
+      <w:pPr>
+        <w:pStyle w:val="7"/>
       </w:pPr>
       <w:r>
         <w:t xml:space="preserve">4.2 Flussi di Dati a Fine Test</w:t>
@@ -6120,91 +6119,91 @@
         <w:t xml:space="preserve">Il report è costruito in Excel (copia/incolla, calcoli, grafici)</w:t>
       </w:r>
     </w:p>
+    <w:bookmarkEnd w:id="69"/>
     <w:bookmarkEnd w:id="70"/>
+    <w:bookmarkStart w:id="73" w:name="punti-di-correlazione-e-gap"/>
+    <w:p>
+      <w:pPr>
+        <w:pStyle w:val="6"/>
+      </w:pPr>
+      <w:r>
+        <w:t xml:space="preserve">5. Punti di Correlazione e Gap</w:t>
+      </w:r>
+    </w:p>
+    <w:bookmarkStart w:id="71" w:name="punti-di-correlazione"/>
+    <w:p>
+      <w:pPr>
+        <w:pStyle w:val="7"/>
+      </w:pPr>
+      <w:r>
+        <w:t xml:space="preserve">5.1 Punti di Correlazione</w:t>
+      </w:r>
+    </w:p>
+    <w:p>
+      <w:pPr>
+        <w:pStyle w:val="Compact"/>
+        <w:numPr>
+          <w:ilvl w:val="0"/>
+          <w:numId w:val="1060"/>
+        </w:numPr>
+      </w:pPr>
+      <w:r>
+        <w:t xml:space="preserve">Tempo di inizio test (definito dall’operatore)</w:t>
+      </w:r>
+    </w:p>
+    <w:p>
+      <w:pPr>
+        <w:pStyle w:val="Compact"/>
+        <w:numPr>
+          <w:ilvl w:val="0"/>
+          <w:numId w:val="1060"/>
+        </w:numPr>
+      </w:pPr>
+      <w:r>
+        <w:t xml:space="preserve">Durata test / tempo di mantenimento</w:t>
+      </w:r>
+    </w:p>
+    <w:p>
+      <w:pPr>
+        <w:pStyle w:val="Compact"/>
+        <w:numPr>
+          <w:ilvl w:val="0"/>
+          <w:numId w:val="1060"/>
+        </w:numPr>
+      </w:pPr>
+      <w:r>
+        <w:t xml:space="preserve">Forma della rampa di pressione</w:t>
+      </w:r>
+    </w:p>
+    <w:p>
+      <w:pPr>
+        <w:pStyle w:val="Compact"/>
+        <w:numPr>
+          <w:ilvl w:val="0"/>
+          <w:numId w:val="1060"/>
+        </w:numPr>
+      </w:pPr>
+      <w:r>
+        <w:t xml:space="preserve">Milestone del profilo di temperatura</w:t>
+      </w:r>
+    </w:p>
+    <w:p>
+      <w:pPr>
+        <w:pStyle w:val="Compact"/>
+        <w:numPr>
+          <w:ilvl w:val="0"/>
+          <w:numId w:val="1060"/>
+        </w:numPr>
+      </w:pPr>
+      <w:r>
+        <w:t xml:space="preserve">Timestamp interni del DUT (se presenti)</w:t>
+      </w:r>
+    </w:p>
     <w:bookmarkEnd w:id="71"/>
-    <w:bookmarkStart w:id="74" w:name="punti-di-correlazione-e-gap"/>
-    <w:p>
-      <w:pPr>
-        <w:pStyle w:val="4"/>
-      </w:pPr>
-      <w:r>
-        <w:t xml:space="preserve">5. Punti di Correlazione e Gap</w:t>
-      </w:r>
-    </w:p>
-    <w:bookmarkStart w:id="72" w:name="punti-di-correlazione"/>
-    <w:p>
-      <w:pPr>
-        <w:pStyle w:val="6"/>
-      </w:pPr>
-      <w:r>
-        <w:t xml:space="preserve">5.1 Punti di Correlazione</w:t>
-      </w:r>
-    </w:p>
-    <w:p>
-      <w:pPr>
-        <w:pStyle w:val="Compact"/>
-        <w:numPr>
-          <w:ilvl w:val="0"/>
-          <w:numId w:val="1060"/>
-        </w:numPr>
-      </w:pPr>
-      <w:r>
-        <w:t xml:space="preserve">Tempo di inizio test (definito dall’operatore)</w:t>
-      </w:r>
-    </w:p>
-    <w:p>
-      <w:pPr>
-        <w:pStyle w:val="Compact"/>
-        <w:numPr>
-          <w:ilvl w:val="0"/>
-          <w:numId w:val="1060"/>
-        </w:numPr>
-      </w:pPr>
-      <w:r>
-        <w:t xml:space="preserve">Durata test / tempo di mantenimento</w:t>
-      </w:r>
-    </w:p>
-    <w:p>
-      <w:pPr>
-        <w:pStyle w:val="Compact"/>
-        <w:numPr>
-          <w:ilvl w:val="0"/>
-          <w:numId w:val="1060"/>
-        </w:numPr>
-      </w:pPr>
-      <w:r>
-        <w:t xml:space="preserve">Forma della rampa di pressione</w:t>
-      </w:r>
-    </w:p>
-    <w:p>
-      <w:pPr>
-        <w:pStyle w:val="Compact"/>
-        <w:numPr>
-          <w:ilvl w:val="0"/>
-          <w:numId w:val="1060"/>
-        </w:numPr>
-      </w:pPr>
-      <w:r>
-        <w:t xml:space="preserve">Milestone del profilo di temperatura</w:t>
-      </w:r>
-    </w:p>
-    <w:p>
-      <w:pPr>
-        <w:pStyle w:val="Compact"/>
-        <w:numPr>
-          <w:ilvl w:val="0"/>
-          <w:numId w:val="1060"/>
-        </w:numPr>
-      </w:pPr>
-      <w:r>
-        <w:t xml:space="preserve">Timestamp interni del DUT (se presenti)</w:t>
-      </w:r>
-    </w:p>
-    <w:bookmarkEnd w:id="72"/>
-    <w:bookmarkStart w:id="73" w:name="gap-attuali"/>
-    <w:p>
-      <w:pPr>
-        <w:pStyle w:val="6"/>
+    <w:bookmarkStart w:id="72" w:name="gap-attuali"/>
+    <w:p>
+      <w:pPr>
+        <w:pStyle w:val="7"/>
       </w:pPr>
       <w:r>
         <w:t xml:space="preserve">5.2 Gap Attuali</w:t>
@@ -6322,90 +6321,90 @@
         <w:t xml:space="preserve">La capacità API del DUT è inutilizzata, impedendo l’integrazione near-real-time</w:t>
       </w:r>
     </w:p>
+    <w:bookmarkEnd w:id="72"/>
     <w:bookmarkEnd w:id="73"/>
+    <w:bookmarkStart w:id="74" w:name="punti-di-contatto-delloperatore"/>
+    <w:p>
+      <w:pPr>
+        <w:pStyle w:val="6"/>
+      </w:pPr>
+      <w:r>
+        <w:t xml:space="preserve">6. Punti di Contatto dell’Operatore</w:t>
+      </w:r>
+    </w:p>
+    <w:p>
+      <w:pPr>
+        <w:pStyle w:val="Compact"/>
+        <w:numPr>
+          <w:ilvl w:val="0"/>
+          <w:numId w:val="1063"/>
+        </w:numPr>
+      </w:pPr>
+      <w:r>
+        <w:t xml:space="preserve">Sequenziamento avvio/arresto su più dispositivi</w:t>
+      </w:r>
+    </w:p>
+    <w:p>
+      <w:pPr>
+        <w:pStyle w:val="Compact"/>
+        <w:numPr>
+          <w:ilvl w:val="0"/>
+          <w:numId w:val="1063"/>
+        </w:numPr>
+      </w:pPr>
+      <w:r>
+        <w:t xml:space="preserve">Conferma manuale degli stati di prontezza</w:t>
+      </w:r>
+    </w:p>
+    <w:p>
+      <w:pPr>
+        <w:pStyle w:val="Compact"/>
+        <w:numPr>
+          <w:ilvl w:val="0"/>
+          <w:numId w:val="1063"/>
+        </w:numPr>
+      </w:pPr>
+      <w:r>
+        <w:t xml:space="preserve">Esportazione manuale da logger/controllore/DUT</w:t>
+      </w:r>
+    </w:p>
+    <w:p>
+      <w:pPr>
+        <w:pStyle w:val="Compact"/>
+        <w:numPr>
+          <w:ilvl w:val="0"/>
+          <w:numId w:val="1063"/>
+        </w:numPr>
+      </w:pPr>
+      <w:r>
+        <w:t xml:space="preserve">Associazione manuale dei file a un test</w:t>
+      </w:r>
+    </w:p>
+    <w:p>
+      <w:pPr>
+        <w:pStyle w:val="Compact"/>
+        <w:numPr>
+          <w:ilvl w:val="0"/>
+          <w:numId w:val="1063"/>
+        </w:numPr>
+      </w:pPr>
+      <w:r>
+        <w:t xml:space="preserve">Calcoli manuali e compilazione report</w:t>
+      </w:r>
+    </w:p>
+    <w:p>
+      <w:pPr>
+        <w:pStyle w:val="FirstParagraph"/>
+      </w:pPr>
+      <w:r>
+        <w:t xml:space="preserve">Questi punti di contatto sono le principali fonti di variabilità operativa e errori nel modello AS-IS.</w:t>
+      </w:r>
+    </w:p>
     <w:bookmarkEnd w:id="74"/>
-    <w:bookmarkStart w:id="75" w:name="punti-di-contatto-delloperatore"/>
-    <w:p>
-      <w:pPr>
-        <w:pStyle w:val="4"/>
-      </w:pPr>
-      <w:r>
-        <w:t xml:space="preserve">6. Punti di Contatto dell’Operatore</w:t>
-      </w:r>
-    </w:p>
-    <w:p>
-      <w:pPr>
-        <w:pStyle w:val="Compact"/>
-        <w:numPr>
-          <w:ilvl w:val="0"/>
-          <w:numId w:val="1063"/>
-        </w:numPr>
-      </w:pPr>
-      <w:r>
-        <w:t xml:space="preserve">Sequenziamento avvio/arresto su più dispositivi</w:t>
-      </w:r>
-    </w:p>
-    <w:p>
-      <w:pPr>
-        <w:pStyle w:val="Compact"/>
-        <w:numPr>
-          <w:ilvl w:val="0"/>
-          <w:numId w:val="1063"/>
-        </w:numPr>
-      </w:pPr>
-      <w:r>
-        <w:t xml:space="preserve">Conferma manuale degli stati di prontezza</w:t>
-      </w:r>
-    </w:p>
-    <w:p>
-      <w:pPr>
-        <w:pStyle w:val="Compact"/>
-        <w:numPr>
-          <w:ilvl w:val="0"/>
-          <w:numId w:val="1063"/>
-        </w:numPr>
-      </w:pPr>
-      <w:r>
-        <w:t xml:space="preserve">Esportazione manuale da logger/controllore/DUT</w:t>
-      </w:r>
-    </w:p>
-    <w:p>
-      <w:pPr>
-        <w:pStyle w:val="Compact"/>
-        <w:numPr>
-          <w:ilvl w:val="0"/>
-          <w:numId w:val="1063"/>
-        </w:numPr>
-      </w:pPr>
-      <w:r>
-        <w:t xml:space="preserve">Associazione manuale dei file a un test</w:t>
-      </w:r>
-    </w:p>
-    <w:p>
-      <w:pPr>
-        <w:pStyle w:val="Compact"/>
-        <w:numPr>
-          <w:ilvl w:val="0"/>
-          <w:numId w:val="1063"/>
-        </w:numPr>
-      </w:pPr>
-      <w:r>
-        <w:t xml:space="preserve">Calcoli manuali e compilazione report</w:t>
-      </w:r>
-    </w:p>
-    <w:p>
-      <w:pPr>
-        <w:pStyle w:val="FirstParagraph"/>
-      </w:pPr>
-      <w:r>
-        <w:t xml:space="preserve">Questi punti di contatto sono le principali fonti di variabilità operativa e errori nel modello AS-IS.</w:t>
-      </w:r>
-    </w:p>
-    <w:bookmarkEnd w:id="75"/>
-    <w:bookmarkStart w:id="76" w:name="diagramma-riassuntivo-testuale"/>
-    <w:p>
-      <w:pPr>
-        <w:pStyle w:val="4"/>
+    <w:bookmarkStart w:id="75" w:name="diagramma-riassuntivo-testuale"/>
+    <w:p>
+      <w:pPr>
+        <w:pStyle w:val="6"/>
       </w:pPr>
       <w:r>
         <w:t xml:space="preserve">7. Diagramma Riassuntivo (Testuale)</w:t>
@@ -6603,11 +6602,11 @@
         <w:t xml:space="preserve">API DUT (dati live) esiste ma non fa parte del flusso operativo</w:t>
       </w:r>
     </w:p>
-    <w:bookmarkEnd w:id="76"/>
-    <w:bookmarkStart w:id="77" w:name="driver-di-baseline-per-to-be"/>
-    <w:p>
-      <w:pPr>
-        <w:pStyle w:val="4"/>
+    <w:bookmarkEnd w:id="75"/>
+    <w:bookmarkStart w:id="76" w:name="driver-di-baseline-per-to-be"/>
+    <w:p>
+      <w:pPr>
+        <w:pStyle w:val="6"/>
       </w:pPr>
       <w:r>
         <w:t xml:space="preserve">8. Driver di Baseline per TO-BE</w:t>
@@ -6689,6 +6688,7 @@
         <w:t xml:space="preserve">Preservare l’indipendenza della sicurezza dai livelli supervisivi/dati</w:t>
       </w:r>
     </w:p>
+    <w:bookmarkEnd w:id="76"/>
     <w:bookmarkEnd w:id="77"/>
     <w:bookmarkStart w:id="94" w:name="descrizione-del-test-bench-to-be"/>
     <w:p>
@@ -9050,7 +9050,7 @@
     </w:p>
     <w:bookmarkEnd w:id="107"/>
     <w:bookmarkEnd w:id="108"/>
-    <w:bookmarkStart w:id="114" w:name="X96ab6ee3e82e7c8be65154b79523fc6cc3dc4fe"/>
+    <w:bookmarkStart w:id="127" w:name="X96ab6ee3e82e7c8be65154b79523fc6cc3dc4fe"/>
     <w:p>
       <w:pPr>
         <w:pStyle w:val="4"/>
@@ -9225,97 +9225,97 @@
     </w:p>
     <w:bookmarkEnd w:id="112"/>
     <w:bookmarkEnd w:id="113"/>
+    <w:bookmarkStart w:id="117" w:name="nuove-superfici-di-esposizione-cyber"/>
+    <w:p>
+      <w:pPr>
+        <w:pStyle w:val="6"/>
+      </w:pPr>
+      <w:r>
+        <w:t xml:space="preserve">3. Nuove Superfici di Esposizione Cyber</w:t>
+      </w:r>
+    </w:p>
+    <w:p>
+      <w:pPr>
+        <w:pStyle w:val="FirstParagraph"/>
+      </w:pPr>
+      <w:r>
+        <w:t xml:space="preserve">L’introduzione di supervisione e capacità remote crea nuovi vettori di attacco:</w:t>
+      </w:r>
+    </w:p>
+    <w:bookmarkStart w:id="114" w:name="sistemi-supervisori-hmi-scada"/>
+    <w:p>
+      <w:pPr>
+        <w:pStyle w:val="7"/>
+      </w:pPr>
+      <w:r>
+        <w:t xml:space="preserve">3.1 Sistemi Supervisori (HMI / SCADA)</w:t>
+      </w:r>
+    </w:p>
+    <w:p>
+      <w:pPr>
+        <w:pStyle w:val="FirstParagraph"/>
+      </w:pPr>
+      <w:r>
+        <w:t xml:space="preserve">Rischi potenziali:</w:t>
+      </w:r>
+    </w:p>
+    <w:p>
+      <w:pPr>
+        <w:pStyle w:val="Compact"/>
+        <w:numPr>
+          <w:ilvl w:val="0"/>
+          <w:numId w:val="1102"/>
+        </w:numPr>
+      </w:pPr>
+      <w:r>
+        <w:t xml:space="preserve">Modifica non autorizzata delle ricette di test</w:t>
+      </w:r>
+    </w:p>
+    <w:p>
+      <w:pPr>
+        <w:pStyle w:val="Compact"/>
+        <w:numPr>
+          <w:ilvl w:val="0"/>
+          <w:numId w:val="1102"/>
+        </w:numPr>
+      </w:pPr>
+      <w:r>
+        <w:t xml:space="preserve">Manipolazione dei parametri di processo</w:t>
+      </w:r>
+    </w:p>
+    <w:p>
+      <w:pPr>
+        <w:pStyle w:val="Compact"/>
+        <w:numPr>
+          <w:ilvl w:val="0"/>
+          <w:numId w:val="1102"/>
+        </w:numPr>
+      </w:pPr>
+      <w:r>
+        <w:t xml:space="preserve">Soppressione o alterazione degli allarmi</w:t>
+      </w:r>
+    </w:p>
+    <w:p>
+      <w:pPr>
+        <w:pStyle w:val="Compact"/>
+        <w:numPr>
+          <w:ilvl w:val="0"/>
+          <w:numId w:val="1102"/>
+        </w:numPr>
+      </w:pPr>
+      <w:r>
+        <w:t xml:space="preserve">Visualizzazione falsa delle variabili di processo</w:t>
+      </w:r>
+    </w:p>
+    <w:p>
+      <w:pPr>
+        <w:pStyle w:val="FirstParagraph"/>
+      </w:pPr>
+      <w:r>
+        <w:t xml:space="preserve">Rilevanza per la sicurezza: Informazioni supervisorie errate possono ritardare l’intervento umano o portare a decisioni inappropriate.</w:t>
+      </w:r>
+    </w:p>
     <w:bookmarkEnd w:id="114"/>
-    <w:bookmarkStart w:id="127" w:name="nuove-superfici-di-esposizione-cyber"/>
-    <w:p>
-      <w:pPr>
-        <w:pStyle w:val="4"/>
-      </w:pPr>
-      <w:r>
-        <w:t xml:space="preserve">3. Nuove Superfici di Esposizione Cyber</w:t>
-      </w:r>
-    </w:p>
-    <w:p>
-      <w:pPr>
-        <w:pStyle w:val="FirstParagraph"/>
-      </w:pPr>
-      <w:r>
-        <w:t xml:space="preserve">L’introduzione di supervisione e capacità remote crea nuovi vettori di attacco:</w:t>
-      </w:r>
-    </w:p>
-    <w:bookmarkStart w:id="117" w:name="sistemi-supervisori-hmi-scada"/>
-    <w:p>
-      <w:pPr>
-        <w:pStyle w:val="6"/>
-      </w:pPr>
-      <w:r>
-        <w:t xml:space="preserve">3.1 Sistemi Supervisori (HMI / SCADA)</w:t>
-      </w:r>
-    </w:p>
-    <w:p>
-      <w:pPr>
-        <w:pStyle w:val="FirstParagraph"/>
-      </w:pPr>
-      <w:r>
-        <w:t xml:space="preserve">Rischi potenziali:</w:t>
-      </w:r>
-    </w:p>
-    <w:p>
-      <w:pPr>
-        <w:pStyle w:val="Compact"/>
-        <w:numPr>
-          <w:ilvl w:val="0"/>
-          <w:numId w:val="1102"/>
-        </w:numPr>
-      </w:pPr>
-      <w:r>
-        <w:t xml:space="preserve">Modifica non autorizzata delle ricette di test</w:t>
-      </w:r>
-    </w:p>
-    <w:p>
-      <w:pPr>
-        <w:pStyle w:val="Compact"/>
-        <w:numPr>
-          <w:ilvl w:val="0"/>
-          <w:numId w:val="1102"/>
-        </w:numPr>
-      </w:pPr>
-      <w:r>
-        <w:t xml:space="preserve">Manipolazione dei parametri di processo</w:t>
-      </w:r>
-    </w:p>
-    <w:p>
-      <w:pPr>
-        <w:pStyle w:val="Compact"/>
-        <w:numPr>
-          <w:ilvl w:val="0"/>
-          <w:numId w:val="1102"/>
-        </w:numPr>
-      </w:pPr>
-      <w:r>
-        <w:t xml:space="preserve">Soppressione o alterazione degli allarmi</w:t>
-      </w:r>
-    </w:p>
-    <w:p>
-      <w:pPr>
-        <w:pStyle w:val="Compact"/>
-        <w:numPr>
-          <w:ilvl w:val="0"/>
-          <w:numId w:val="1102"/>
-        </w:numPr>
-      </w:pPr>
-      <w:r>
-        <w:t xml:space="preserve">Visualizzazione falsa delle variabili di processo</w:t>
-      </w:r>
-    </w:p>
-    <w:p>
-      <w:pPr>
-        <w:pStyle w:val="FirstParagraph"/>
-      </w:pPr>
-      <w:r>
-        <w:t xml:space="preserve">Rilevanza per la sicurezza: Informazioni supervisorie errate possono ritardare l’intervento umano o portare a decisioni inappropriate.</w:t>
-      </w:r>
-    </w:p>
     <w:bookmarkStart w:id="115" w:name="canali-di-accesso-remoto"/>
     <w:p>
       <w:pPr>

</xml_diff>